<commit_message>
Remove the Pair share section from the Pick Your Task worksheet
</commit_message>
<xml_diff>
--- a/handouts/Pick Your Task Worksheet.docx
+++ b/handouts/Pick Your Task Worksheet.docx
@@ -476,142 +476,6 @@
         <w:gridCol w:w="10512"/>
       </w:tblGrid>
       <w:tr>
-        <w:trPr>
-          <w:trHeight w:val="1500" w:hRule="atLeast"/>
-        </w:trPr>
-        <w:tc>
-          <w:tcPr>
-            <w:tcW w:type="dxa" w:w="10512"/>
-            <w:tcBorders>
-              <w:top w:val="single" w:color="8C8C8C" w:sz="6"/>
-              <w:left w:val="single" w:color="A51417" w:sz="24"/>
-              <w:bottom w:val="single" w:color="8C8C8C" w:sz="6"/>
-              <w:right w:val="single" w:color="8C8C8C" w:sz="6"/>
-            </w:tcBorders>
-            <w:tcMar>
-              <w:top w:type="dxa" w:w="120"/>
-              <w:left w:type="dxa" w:w="180"/>
-              <w:bottom w:type="dxa" w:w="120"/>
-              <w:right w:type="dxa" w:w="180"/>
-            </w:tcMar>
-          </w:tcPr>
-          <w:p>
-            <w:pPr>
-              <w:spacing w:after="60"/>
-            </w:pPr>
-            <w:r>
-              <w:rPr>
-                <w:rFonts w:ascii="Arial" w:cs="Arial" w:eastAsia="Arial" w:hAnsi="Arial"/>
-                <w:b/>
-                <w:bCs/>
-                <w:sz w:val="24"/>
-                <w:szCs w:val="24"/>
-              </w:rPr>
-              <w:t xml:space="preserve">Pair share  </w:t>
-            </w:r>
-            <w:r>
-              <w:rPr>
-                <w:rFonts w:ascii="Arial" w:cs="Arial" w:eastAsia="Arial" w:hAnsi="Arial"/>
-                <w:color w:val="666666"/>
-                <w:sz w:val="20"/>
-                <w:szCs w:val="20"/>
-              </w:rPr>
-              <w:t xml:space="preserve">3 minutes</w:t>
-            </w:r>
-          </w:p>
-          <w:p>
-            <w:pPr>
-              <w:spacing w:after="160"/>
-            </w:pPr>
-            <w:r>
-              <w:rPr>
-                <w:rFonts w:ascii="Arial" w:cs="Arial" w:eastAsia="Arial" w:hAnsi="Arial"/>
-                <w:sz w:val="20"/>
-                <w:szCs w:val="20"/>
-              </w:rPr>
-              <w:t xml:space="preserve">Explain your task to a neighbor, then listen to theirs. Ask one question about it.</w:t>
-            </w:r>
-          </w:p>
-          <w:p>
-            <w:pPr>
-              <w:spacing w:after="140"/>
-            </w:pPr>
-            <w:r>
-              <w:rPr>
-                <w:rFonts w:ascii="Arial" w:cs="Arial" w:eastAsia="Arial" w:hAnsi="Arial"/>
-                <w:b/>
-                <w:bCs/>
-                <w:sz w:val="20"/>
-                <w:szCs w:val="20"/>
-              </w:rPr>
-              <w:t xml:space="preserve">My neighbor's task:  </w:t>
-            </w:r>
-            <w:r>
-              <w:rPr>
-                <w:rFonts w:ascii="Arial" w:cs="Arial" w:eastAsia="Arial" w:hAnsi="Arial"/>
-                <w:color w:val="8C8C8C"/>
-                <w:sz w:val="20"/>
-                <w:szCs w:val="20"/>
-              </w:rPr>
-              <w:t xml:space="preserve">__________________________________________________________</w:t>
-            </w:r>
-          </w:p>
-          <w:p>
-            <w:pPr>
-              <w:spacing w:after="0"/>
-            </w:pPr>
-            <w:r>
-              <w:rPr>
-                <w:rFonts w:ascii="Arial" w:cs="Arial" w:eastAsia="Arial" w:hAnsi="Arial"/>
-                <w:b/>
-                <w:bCs/>
-                <w:sz w:val="20"/>
-                <w:szCs w:val="20"/>
-              </w:rPr>
-              <w:t xml:space="preserve">Something I want to borrow from it:  </w:t>
-            </w:r>
-            <w:r>
-              <w:rPr>
-                <w:rFonts w:ascii="Arial" w:cs="Arial" w:eastAsia="Arial" w:hAnsi="Arial"/>
-                <w:color w:val="8C8C8C"/>
-                <w:sz w:val="20"/>
-                <w:szCs w:val="20"/>
-              </w:rPr>
-              <w:t xml:space="preserve">______________________________________</w:t>
-            </w:r>
-          </w:p>
-        </w:tc>
-      </w:tr>
-    </w:tbl>
-    <w:p>
-      <w:pPr>
-        <w:spacing w:after="60"/>
-      </w:pPr>
-      <w:r>
-        <w:rPr>
-          <w:rFonts w:ascii="Arial" w:cs="Arial" w:eastAsia="Arial" w:hAnsi="Arial"/>
-          <w:sz w:val="20"/>
-          <w:szCs w:val="20"/>
-        </w:rPr>
-        <w:t xml:space="preserve"/>
-      </w:r>
-    </w:p>
-    <w:tbl>
-      <w:tblPr>
-        <w:tblW w:type="dxa" w:w="10512"/>
-        <w:tblBorders>
-          <w:top w:val="single" w:color="auto" w:sz="4"/>
-          <w:left w:val="single" w:color="auto" w:sz="4"/>
-          <w:bottom w:val="single" w:color="auto" w:sz="4"/>
-          <w:right w:val="single" w:color="auto" w:sz="4"/>
-          <w:insideH w:val="single" w:color="auto" w:sz="4"/>
-          <w:insideV w:val="single" w:color="auto" w:sz="4"/>
-        </w:tblBorders>
-      </w:tblPr>
-      <w:tblGrid>
-        <w:gridCol w:w="10512"/>
-      </w:tblGrid>
-      <w:tr>
         <w:tc>
           <w:tcPr>
             <w:tcW w:type="dxa" w:w="10512"/>

</xml_diff>